<commit_message>
Update math formatting and book cover authorship
</commit_message>
<xml_diff>
--- a/capitulos_word_pt/cap01_cornea_biomecanica.docx
+++ b/capitulos_word_pt/cap01_cornea_biomecanica.docx
@@ -51,7 +51,33 @@
           <w:color w:val="334E68"/>
           <w:sz w:val="21"/>
         </w:rPr>
-        <w:t>Parte I — Fundamentos</w:t>
+        <w:t>Parte I — O Problema e os Fundamentos</w:t>
+      </w:r>
+    </w:p>
+    <w:p>
+      <w:pPr>
+        <w:spacing w:before="80" w:after="120" w:line="276" w:lineRule="auto"/>
+        <w:ind w:left="720" w:right="720"/>
+      </w:pPr>
+      <w:r>
+        <w:rPr>
+          <w:rFonts w:ascii="Calibri" w:hAnsi="Calibri"/>
+          <w:b/>
+          <w:i w:val="0"/>
+          <w:color w:val="334E68"/>
+          <w:sz w:val="21"/>
+        </w:rPr>
+        <w:t>Ponto-Chave:</w:t>
+      </w:r>
+      <w:r>
+        <w:rPr>
+          <w:rFonts w:ascii="Calibri" w:hAnsi="Calibri"/>
+          <w:b w:val="0"/>
+          <w:i w:val="0"/>
+          <w:color w:val="334E68"/>
+          <w:sz w:val="21"/>
+        </w:rPr>
+        <w:t xml:space="preserve"> O ceratocone não é apenas uma córnea curva — é uma doença do material estromal. Dois olhos com o mesmo K-steep podem ter estados biomecânicos completamente diferentes. Um nomograma que ignora isso está a tratar o sintoma, não a doença.</w:t>
       </w:r>
     </w:p>
     <w:p>
@@ -157,7 +183,27 @@
           <w:color w:val="222222"/>
           <w:sz w:val="22"/>
         </w:rPr>
-        <w:t xml:space="preserve">Nas últimas duas décadas, uma mudança de paradigma vem ganhando força. O trabalho de Dupps e Roberts (2001, 2014), Meek e Knupp (2015) e outros estabeleceu que o ceratocone é, em sua essência, uma </w:t>
+        <w:t>Nas últimas duas décadas, uma mudança de paradigma estrutural e bibliográfica vem ganhando força na oftalmologia. O trabalho seminal de Dupps e Roberts (2001, e consolidado em 2014 em seu artigo "</w:t>
+      </w:r>
+      <w:r>
+        <w:rPr>
+          <w:rFonts w:ascii="Calibri" w:hAnsi="Calibri"/>
+          <w:b w:val="0"/>
+          <w:i/>
+          <w:color w:val="222222"/>
+          <w:sz w:val="22"/>
+        </w:rPr>
+        <w:t>Biomechanics of corneal ectasia and biomechanical treatments</w:t>
+      </w:r>
+      <w:r>
+        <w:rPr>
+          <w:rFonts w:ascii="Calibri" w:hAnsi="Calibri"/>
+          <w:b w:val="0"/>
+          <w:i w:val="0"/>
+          <w:color w:val="222222"/>
+          <w:sz w:val="22"/>
+        </w:rPr>
+        <w:t xml:space="preserve">"), juntamente com as investigações estruturais de Meek e Knupp (2015), estabeleceu inequivocamente que o ceratocone é, em sua essência, uma </w:t>
       </w:r>
       <w:r>
         <w:rPr>
@@ -167,7 +213,7 @@
           <w:color w:val="222222"/>
           <w:sz w:val="22"/>
         </w:rPr>
-        <w:t>doença biomecânica</w:t>
+        <w:t>doença primariamente biomecânica</w:t>
       </w:r>
       <w:r>
         <w:rPr>
@@ -177,7 +223,7 @@
           <w:color w:val="222222"/>
           <w:sz w:val="22"/>
         </w:rPr>
-        <w:t xml:space="preserve"> — um distúrbio de distribuição de tensão (stress) estromal, integridade das fibras de colágeno e degradação das propriedades do material. As manifestações geométricas (K elevado, afinamento, protrusão) são </w:t>
+        <w:t xml:space="preserve"> — um distúrbio da distribuição de tensão (</w:t>
       </w:r>
       <w:r>
         <w:rPr>
@@ -187,7 +233,7 @@
           <w:color w:val="222222"/>
           <w:sz w:val="22"/>
         </w:rPr>
-        <w:t>consequências</w:t>
+        <w:t>stress</w:t>
       </w:r>
       <w:r>
         <w:rPr>
@@ -197,7 +243,39 @@
           <w:color w:val="222222"/>
           <w:sz w:val="22"/>
         </w:rPr>
-        <w:t xml:space="preserve"> de um processo mecânico subjacente, não o processo em si. Duas córneas com valores idênticos de K-steep podem abrigar estados de tensão (stress), rigidez de material e propensões para progressão extremamente diferentes. Tratá-las de forma idêntica, como faz um nomograma, é confundir o sintoma com a doença.</w:t>
+        <w:t>) estromal, com degradação focal das propriedades elásticas do material.</w:t>
+      </w:r>
+    </w:p>
+    <w:p>
+      <w:r>
+        <w:rPr>
+          <w:rFonts w:ascii="Calibri" w:hAnsi="Calibri"/>
+          <w:b w:val="0"/>
+          <w:i w:val="0"/>
+          <w:color w:val="222222"/>
+          <w:sz w:val="22"/>
+        </w:rPr>
+        <w:t xml:space="preserve">As manifestações geométricas clássicas (K elevado, afinamento paquimétrico, protrusão apical) não são a patologia em si, mas sim as </w:t>
+      </w:r>
+      <w:r>
+        <w:rPr>
+          <w:rFonts w:ascii="Calibri" w:hAnsi="Calibri"/>
+          <w:b w:val="0"/>
+          <w:i/>
+          <w:color w:val="222222"/>
+          <w:sz w:val="22"/>
+        </w:rPr>
+        <w:t>consequências mecânicas secundárias (sintomas)</w:t>
+      </w:r>
+      <w:r>
+        <w:rPr>
+          <w:rFonts w:ascii="Calibri" w:hAnsi="Calibri"/>
+          <w:b w:val="0"/>
+          <w:i w:val="0"/>
+          <w:color w:val="222222"/>
+          <w:sz w:val="22"/>
+        </w:rPr>
+        <w:t xml:space="preserve"> de uma estrutura enfraquecida cedendo perante a pressão intraocular normal. Duas córneas com valores idênticos de K-steep podem abrigar estados de tensão, rigidez de material e propensões para progressão extremamente diferentes. Tratá-las de forma idêntica e puramente geométrica, como faz um nomograma clássico, é confundir o sintoma (a forma) com a doença (a fraqueza mecânica).</w:t>
       </w:r>
     </w:p>
     <w:p>
@@ -240,6 +318,52 @@
           <w:sz w:val="28"/>
         </w:rPr>
         <w:t>1.2 Anatomia Fibrilar do Estroma Corneano</w:t>
+      </w:r>
+    </w:p>
+    <w:p>
+      <w:pPr>
+        <w:spacing w:before="80" w:after="120" w:line="276" w:lineRule="auto"/>
+        <w:ind w:left="720" w:right="720"/>
+      </w:pPr>
+      <w:r>
+        <w:rPr>
+          <w:rFonts w:ascii="Calibri" w:hAnsi="Calibri"/>
+          <w:b/>
+          <w:i w:val="0"/>
+          <w:color w:val="334E68"/>
+          <w:sz w:val="21"/>
+        </w:rPr>
+        <w:t>Para o Clínico:</w:t>
+      </w:r>
+      <w:r>
+        <w:rPr>
+          <w:rFonts w:ascii="Calibri" w:hAnsi="Calibri"/>
+          <w:b w:val="0"/>
+          <w:i w:val="0"/>
+          <w:color w:val="334E68"/>
+          <w:sz w:val="21"/>
+        </w:rPr>
+        <w:t xml:space="preserve"> Esta secção explica </w:t>
+      </w:r>
+      <w:r>
+        <w:rPr>
+          <w:rFonts w:ascii="Calibri" w:hAnsi="Calibri"/>
+          <w:b w:val="0"/>
+          <w:i/>
+          <w:color w:val="334E68"/>
+          <w:sz w:val="21"/>
+        </w:rPr>
+        <w:t>por que</w:t>
+      </w:r>
+      <w:r>
+        <w:rPr>
+          <w:rFonts w:ascii="Calibri" w:hAnsi="Calibri"/>
+          <w:b w:val="0"/>
+          <w:i w:val="0"/>
+          <w:color w:val="334E68"/>
+          <w:sz w:val="21"/>
+        </w:rPr>
+        <w:t xml:space="preserve"> a córnea se comporta como se comporta sob pressão. O conceito central é simples: a córnea é um material compósito (como fibra de vidro), com fibras de colagénio (que dão rigidez) embebidas numa matriz macia (que dá flexibilidade). A orientação dessas fibras determina onde a córnea é forte e onde é vulnerável.</w:t>
       </w:r>
     </w:p>
     <w:p>
@@ -734,6 +858,52 @@
           <w:sz w:val="24"/>
         </w:rPr>
         <w:t>O Modelo Holzapfel-Gasser-Ogden (HGO)</w:t>
+      </w:r>
+    </w:p>
+    <w:p>
+      <w:pPr>
+        <w:spacing w:before="80" w:after="120" w:line="276" w:lineRule="auto"/>
+        <w:ind w:left="720" w:right="720"/>
+      </w:pPr>
+      <w:r>
+        <w:rPr>
+          <w:rFonts w:ascii="Calibri" w:hAnsi="Calibri"/>
+          <w:b/>
+          <w:i w:val="0"/>
+          <w:color w:val="334E68"/>
+          <w:sz w:val="21"/>
+        </w:rPr>
+        <w:t>Para o Clínico:</w:t>
+      </w:r>
+      <w:r>
+        <w:rPr>
+          <w:rFonts w:ascii="Calibri" w:hAnsi="Calibri"/>
+          <w:b w:val="0"/>
+          <w:i w:val="0"/>
+          <w:color w:val="334E68"/>
+          <w:sz w:val="21"/>
+        </w:rPr>
+        <w:t xml:space="preserve"> O modelo HGO é a equação matemática que usamos para simular a córnea no computador. Não precisa de memorizar a equação — o que importa são os </w:t>
+      </w:r>
+      <w:r>
+        <w:rPr>
+          <w:rFonts w:ascii="Calibri" w:hAnsi="Calibri"/>
+          <w:b/>
+          <w:i w:val="0"/>
+          <w:color w:val="334E68"/>
+          <w:sz w:val="21"/>
+        </w:rPr>
+        <w:t>5 parâmetros</w:t>
+      </w:r>
+      <w:r>
+        <w:rPr>
+          <w:rFonts w:ascii="Calibri" w:hAnsi="Calibri"/>
+          <w:b w:val="0"/>
+          <w:i w:val="0"/>
+          <w:color w:val="334E68"/>
+          <w:sz w:val="21"/>
+        </w:rPr>
+        <w:t xml:space="preserve"> da tabela abaixo. Cada um descreve um aspeto diferente do material corneano, e as nossas simulações usam estes valores em todo o livro.</w:t>
       </w:r>
     </w:p>
     <w:p>
@@ -1849,6 +2019,32 @@
       </w:r>
     </w:p>
     <w:p>
+      <w:pPr>
+        <w:spacing w:before="80" w:after="120" w:line="276" w:lineRule="auto"/>
+        <w:ind w:left="720" w:right="720"/>
+      </w:pPr>
+      <w:r>
+        <w:rPr>
+          <w:rFonts w:ascii="Calibri" w:hAnsi="Calibri"/>
+          <w:b/>
+          <w:i w:val="0"/>
+          <w:color w:val="334E68"/>
+          <w:sz w:val="21"/>
+        </w:rPr>
+        <w:t>Ponto-Chave:</w:t>
+      </w:r>
+      <w:r>
+        <w:rPr>
+          <w:rFonts w:ascii="Calibri" w:hAnsi="Calibri"/>
+          <w:b w:val="0"/>
+          <w:i w:val="0"/>
+          <w:color w:val="334E68"/>
+          <w:sz w:val="21"/>
+        </w:rPr>
+        <w:t xml:space="preserve"> O ciclo de Dupps é a razão pela qual o ceratocone progride. É um ciclo vicioso: fraqueza → deformação → mais tensão → mais fraqueza. É também a razão pela qual o CXL funciona (interrompe o ciclo ao reforçar as fibras) e por que o ICRS funciona (redistribui as tensões).</w:t>
+      </w:r>
+    </w:p>
+    <w:p>
       <w:r>
         <w:rPr>
           <w:rFonts w:ascii="Calibri" w:hAnsi="Calibri"/>
@@ -2906,6 +3102,968 @@
     </w:p>
     <w:p>
       <w:pPr>
+        <w:pStyle w:val="Heading3"/>
+      </w:pPr>
+      <w:r/>
+      <w:r>
+        <w:rPr>
+          <w:rFonts w:ascii="Calibri" w:hAnsi="Calibri"/>
+          <w:b w:val="0"/>
+          <w:i w:val="0"/>
+          <w:color w:val="1B365D"/>
+          <w:sz w:val="24"/>
+        </w:rPr>
+        <w:t>Tabela-Resumo: Conceitos-Chave para o Clínico</w:t>
+      </w:r>
+    </w:p>
+    <w:tbl>
+      <w:tblPr>
+        <w:tblW w:type="auto" w:w="0"/>
+        <w:jc w:val="center"/>
+        <w:tblLayout w:type="autofit"/>
+        <w:tblLook w:firstColumn="1" w:firstRow="1" w:lastColumn="0" w:lastRow="0" w:noHBand="0" w:noVBand="1" w:val="04A0"/>
+        <w:tblBorders>
+          <w:top w:val="single" w:sz="4" w:space="0" w:color="CCCCCC"/>
+          <w:bottom w:val="single" w:sz="4" w:space="0" w:color="CCCCCC"/>
+          <w:left w:val="none"/>
+          <w:right w:val="none"/>
+          <w:insideH w:val="single" w:sz="4" w:space="0" w:color="E0E0E0"/>
+          <w:insideV w:val="none"/>
+        </w:tblBorders>
+      </w:tblPr>
+      <w:tblGrid>
+        <w:gridCol w:w="2880"/>
+        <w:gridCol w:w="2880"/>
+        <w:gridCol w:w="2880"/>
+      </w:tblGrid>
+      <w:tr>
+        <w:tc>
+          <w:tcPr>
+            <w:tcW w:type="dxa" w:w="2880"/>
+            <w:shd w:fill="1B365D"/>
+            <w:tcMar>
+              <w:top w:w="100" w:type="dxa"/>
+              <w:bottom w:w="100" w:type="dxa"/>
+              <w:left w:w="150" w:type="dxa"/>
+              <w:right w:w="150" w:type="dxa"/>
+            </w:tcMar>
+            <w:vAlign w:val="center"/>
+          </w:tcPr>
+          <w:p>
+            <w:pPr>
+              <w:spacing w:before="80" w:after="80"/>
+              <w:jc w:val="left"/>
+            </w:pPr>
+            <w:r>
+              <w:rPr>
+                <w:b/>
+                <w:color w:val="FFFFFF"/>
+              </w:rPr>
+            </w:r>
+            <w:r>
+              <w:rPr>
+                <w:rFonts w:ascii="Calibri" w:hAnsi="Calibri"/>
+                <w:b/>
+                <w:i w:val="0"/>
+                <w:color w:val="FFFFFF"/>
+                <w:sz w:val="21"/>
+              </w:rPr>
+              <w:t>Conceito</w:t>
+            </w:r>
+          </w:p>
+        </w:tc>
+        <w:tc>
+          <w:tcPr>
+            <w:tcW w:type="dxa" w:w="2880"/>
+            <w:shd w:fill="1B365D"/>
+            <w:tcMar>
+              <w:top w:w="100" w:type="dxa"/>
+              <w:bottom w:w="100" w:type="dxa"/>
+              <w:left w:w="150" w:type="dxa"/>
+              <w:right w:w="150" w:type="dxa"/>
+            </w:tcMar>
+            <w:vAlign w:val="center"/>
+          </w:tcPr>
+          <w:p>
+            <w:pPr>
+              <w:spacing w:before="80" w:after="80"/>
+              <w:jc w:val="left"/>
+            </w:pPr>
+            <w:r>
+              <w:rPr>
+                <w:b/>
+                <w:color w:val="FFFFFF"/>
+              </w:rPr>
+            </w:r>
+            <w:r>
+              <w:rPr>
+                <w:rFonts w:ascii="Calibri" w:hAnsi="Calibri"/>
+                <w:b/>
+                <w:i w:val="0"/>
+                <w:color w:val="FFFFFF"/>
+                <w:sz w:val="21"/>
+              </w:rPr>
+              <w:t>O Que É</w:t>
+            </w:r>
+          </w:p>
+        </w:tc>
+        <w:tc>
+          <w:tcPr>
+            <w:tcW w:type="dxa" w:w="2880"/>
+            <w:shd w:fill="1B365D"/>
+            <w:tcMar>
+              <w:top w:w="100" w:type="dxa"/>
+              <w:bottom w:w="100" w:type="dxa"/>
+              <w:left w:w="150" w:type="dxa"/>
+              <w:right w:w="150" w:type="dxa"/>
+            </w:tcMar>
+            <w:vAlign w:val="center"/>
+          </w:tcPr>
+          <w:p>
+            <w:pPr>
+              <w:spacing w:before="80" w:after="80"/>
+              <w:jc w:val="left"/>
+            </w:pPr>
+            <w:r>
+              <w:rPr>
+                <w:b/>
+                <w:color w:val="FFFFFF"/>
+              </w:rPr>
+            </w:r>
+            <w:r>
+              <w:rPr>
+                <w:rFonts w:ascii="Calibri" w:hAnsi="Calibri"/>
+                <w:b/>
+                <w:i w:val="0"/>
+                <w:color w:val="FFFFFF"/>
+                <w:sz w:val="21"/>
+              </w:rPr>
+              <w:t>Por Que Importa ao Cirurgião</w:t>
+            </w:r>
+          </w:p>
+        </w:tc>
+      </w:tr>
+      <w:tr>
+        <w:tc>
+          <w:tcPr>
+            <w:tcW w:type="dxa" w:w="2880"/>
+            <w:tcMar>
+              <w:top w:w="80" w:type="dxa"/>
+              <w:bottom w:w="80" w:type="dxa"/>
+              <w:left w:w="120" w:type="dxa"/>
+              <w:right w:w="120" w:type="dxa"/>
+            </w:tcMar>
+            <w:vAlign w:val="center"/>
+          </w:tcPr>
+          <w:p>
+            <w:pPr>
+              <w:spacing w:before="80" w:after="80"/>
+              <w:jc w:val="left"/>
+            </w:pPr>
+            <w:r/>
+            <w:r>
+              <w:rPr>
+                <w:rFonts w:ascii="Calibri" w:hAnsi="Calibri"/>
+                <w:b w:val="0"/>
+                <w:i w:val="0"/>
+                <w:color w:val="222222"/>
+                <w:sz w:val="19"/>
+              </w:rPr>
+              <w:t>Modelo HGO</w:t>
+            </w:r>
+          </w:p>
+        </w:tc>
+        <w:tc>
+          <w:tcPr>
+            <w:tcW w:type="dxa" w:w="2880"/>
+            <w:tcMar>
+              <w:top w:w="80" w:type="dxa"/>
+              <w:bottom w:w="80" w:type="dxa"/>
+              <w:left w:w="120" w:type="dxa"/>
+              <w:right w:w="120" w:type="dxa"/>
+            </w:tcMar>
+            <w:vAlign w:val="center"/>
+          </w:tcPr>
+          <w:p>
+            <w:pPr>
+              <w:spacing w:before="80" w:after="80"/>
+              <w:jc w:val="left"/>
+            </w:pPr>
+            <w:r/>
+            <w:r>
+              <w:rPr>
+                <w:rFonts w:ascii="Calibri" w:hAnsi="Calibri"/>
+                <w:b w:val="0"/>
+                <w:i w:val="0"/>
+                <w:color w:val="222222"/>
+                <w:sz w:val="19"/>
+              </w:rPr>
+              <w:t>Equação que descreve a mecânica da córnea como compósito fibra+matriz</w:t>
+            </w:r>
+          </w:p>
+        </w:tc>
+        <w:tc>
+          <w:tcPr>
+            <w:tcW w:type="dxa" w:w="2880"/>
+            <w:tcMar>
+              <w:top w:w="80" w:type="dxa"/>
+              <w:bottom w:w="80" w:type="dxa"/>
+              <w:left w:w="120" w:type="dxa"/>
+              <w:right w:w="120" w:type="dxa"/>
+            </w:tcMar>
+            <w:vAlign w:val="center"/>
+          </w:tcPr>
+          <w:p>
+            <w:pPr>
+              <w:spacing w:before="80" w:after="80"/>
+              <w:jc w:val="left"/>
+            </w:pPr>
+            <w:r/>
+            <w:r>
+              <w:rPr>
+                <w:rFonts w:ascii="Calibri" w:hAnsi="Calibri"/>
+                <w:b w:val="0"/>
+                <w:i w:val="0"/>
+                <w:color w:val="222222"/>
+                <w:sz w:val="19"/>
+              </w:rPr>
+              <w:t>Os 5 parâmetros (c, k₁, k₂, κ, k) determinam como a córnea responde ao anel</w:t>
+            </w:r>
+          </w:p>
+        </w:tc>
+      </w:tr>
+      <w:tr>
+        <w:tc>
+          <w:tcPr>
+            <w:tcW w:type="dxa" w:w="2880"/>
+            <w:shd w:fill="F2F4F7"/>
+            <w:tcMar>
+              <w:top w:w="80" w:type="dxa"/>
+              <w:bottom w:w="80" w:type="dxa"/>
+              <w:left w:w="120" w:type="dxa"/>
+              <w:right w:w="120" w:type="dxa"/>
+            </w:tcMar>
+            <w:vAlign w:val="center"/>
+          </w:tcPr>
+          <w:p>
+            <w:pPr>
+              <w:spacing w:before="80" w:after="80"/>
+              <w:jc w:val="left"/>
+            </w:pPr>
+            <w:r/>
+            <w:r>
+              <w:rPr>
+                <w:rFonts w:ascii="Calibri" w:hAnsi="Calibri"/>
+                <w:b w:val="0"/>
+                <w:i w:val="0"/>
+                <w:color w:val="222222"/>
+                <w:sz w:val="19"/>
+              </w:rPr>
+              <w:t>c = 0.05 MPa</w:t>
+            </w:r>
+          </w:p>
+        </w:tc>
+        <w:tc>
+          <w:tcPr>
+            <w:tcW w:type="dxa" w:w="2880"/>
+            <w:shd w:fill="F2F4F7"/>
+            <w:tcMar>
+              <w:top w:w="80" w:type="dxa"/>
+              <w:bottom w:w="80" w:type="dxa"/>
+              <w:left w:w="120" w:type="dxa"/>
+              <w:right w:w="120" w:type="dxa"/>
+            </w:tcMar>
+            <w:vAlign w:val="center"/>
+          </w:tcPr>
+          <w:p>
+            <w:pPr>
+              <w:spacing w:before="80" w:after="80"/>
+              <w:jc w:val="left"/>
+            </w:pPr>
+            <w:r/>
+            <w:r>
+              <w:rPr>
+                <w:rFonts w:ascii="Calibri" w:hAnsi="Calibri"/>
+                <w:b w:val="0"/>
+                <w:i w:val="0"/>
+                <w:color w:val="222222"/>
+                <w:sz w:val="19"/>
+              </w:rPr>
+              <w:t>Módulo de cisalhamento da matriz (gel sem fibras)</w:t>
+            </w:r>
+          </w:p>
+        </w:tc>
+        <w:tc>
+          <w:tcPr>
+            <w:tcW w:type="dxa" w:w="2880"/>
+            <w:shd w:fill="F2F4F7"/>
+            <w:tcMar>
+              <w:top w:w="80" w:type="dxa"/>
+              <w:bottom w:w="80" w:type="dxa"/>
+              <w:left w:w="120" w:type="dxa"/>
+              <w:right w:w="120" w:type="dxa"/>
+            </w:tcMar>
+            <w:vAlign w:val="center"/>
+          </w:tcPr>
+          <w:p>
+            <w:pPr>
+              <w:spacing w:before="80" w:after="80"/>
+              <w:jc w:val="left"/>
+            </w:pPr>
+            <w:r/>
+            <w:r>
+              <w:rPr>
+                <w:rFonts w:ascii="Calibri" w:hAnsi="Calibri"/>
+                <w:b w:val="0"/>
+                <w:i w:val="0"/>
+                <w:color w:val="222222"/>
+                <w:sz w:val="19"/>
+              </w:rPr>
+              <w:t>Quando degrada no ceratocone, a córnea torna-se mais macia — é isto que o CXL não reverte diretamente</w:t>
+            </w:r>
+          </w:p>
+        </w:tc>
+      </w:tr>
+      <w:tr>
+        <w:tc>
+          <w:tcPr>
+            <w:tcW w:type="dxa" w:w="2880"/>
+            <w:tcMar>
+              <w:top w:w="80" w:type="dxa"/>
+              <w:bottom w:w="80" w:type="dxa"/>
+              <w:left w:w="120" w:type="dxa"/>
+              <w:right w:w="120" w:type="dxa"/>
+            </w:tcMar>
+            <w:vAlign w:val="center"/>
+          </w:tcPr>
+          <w:p>
+            <w:pPr>
+              <w:spacing w:before="80" w:after="80"/>
+              <w:jc w:val="left"/>
+            </w:pPr>
+            <w:r/>
+            <w:r>
+              <w:rPr>
+                <w:rFonts w:ascii="Calibri" w:hAnsi="Calibri"/>
+                <w:b w:val="0"/>
+                <w:i w:val="0"/>
+                <w:color w:val="222222"/>
+                <w:sz w:val="19"/>
+              </w:rPr>
+              <w:t>k₁ = 0.22 MPa</w:t>
+            </w:r>
+          </w:p>
+        </w:tc>
+        <w:tc>
+          <w:tcPr>
+            <w:tcW w:type="dxa" w:w="2880"/>
+            <w:tcMar>
+              <w:top w:w="80" w:type="dxa"/>
+              <w:bottom w:w="80" w:type="dxa"/>
+              <w:left w:w="120" w:type="dxa"/>
+              <w:right w:w="120" w:type="dxa"/>
+            </w:tcMar>
+            <w:vAlign w:val="center"/>
+          </w:tcPr>
+          <w:p>
+            <w:pPr>
+              <w:spacing w:before="80" w:after="80"/>
+              <w:jc w:val="left"/>
+            </w:pPr>
+            <w:r/>
+            <w:r>
+              <w:rPr>
+                <w:rFonts w:ascii="Calibri" w:hAnsi="Calibri"/>
+                <w:b w:val="0"/>
+                <w:i w:val="0"/>
+                <w:color w:val="222222"/>
+                <w:sz w:val="19"/>
+              </w:rPr>
+              <w:t>Rigidez das fibras de colagénio</w:t>
+            </w:r>
+          </w:p>
+        </w:tc>
+        <w:tc>
+          <w:tcPr>
+            <w:tcW w:type="dxa" w:w="2880"/>
+            <w:tcMar>
+              <w:top w:w="80" w:type="dxa"/>
+              <w:bottom w:w="80" w:type="dxa"/>
+              <w:left w:w="120" w:type="dxa"/>
+              <w:right w:w="120" w:type="dxa"/>
+            </w:tcMar>
+            <w:vAlign w:val="center"/>
+          </w:tcPr>
+          <w:p>
+            <w:pPr>
+              <w:spacing w:before="80" w:after="80"/>
+              <w:jc w:val="left"/>
+            </w:pPr>
+            <w:r/>
+            <w:r>
+              <w:rPr>
+                <w:rFonts w:ascii="Calibri" w:hAnsi="Calibri"/>
+                <w:b w:val="0"/>
+                <w:i w:val="0"/>
+                <w:color w:val="222222"/>
+                <w:sz w:val="19"/>
+              </w:rPr>
+              <w:t>É o parâmetro que o CXL aumenta (50–200%); o reforço das fibras é a base da estabilização</w:t>
+            </w:r>
+          </w:p>
+        </w:tc>
+      </w:tr>
+      <w:tr>
+        <w:tc>
+          <w:tcPr>
+            <w:tcW w:type="dxa" w:w="2880"/>
+            <w:shd w:fill="F2F4F7"/>
+            <w:tcMar>
+              <w:top w:w="80" w:type="dxa"/>
+              <w:bottom w:w="80" w:type="dxa"/>
+              <w:left w:w="120" w:type="dxa"/>
+              <w:right w:w="120" w:type="dxa"/>
+            </w:tcMar>
+            <w:vAlign w:val="center"/>
+          </w:tcPr>
+          <w:p>
+            <w:pPr>
+              <w:spacing w:before="80" w:after="80"/>
+              <w:jc w:val="left"/>
+            </w:pPr>
+            <w:r/>
+            <w:r>
+              <w:rPr>
+                <w:rFonts w:ascii="Calibri" w:hAnsi="Calibri"/>
+                <w:b w:val="0"/>
+                <w:i w:val="0"/>
+                <w:color w:val="222222"/>
+                <w:sz w:val="19"/>
+              </w:rPr>
+              <w:t>k₂ = 100</w:t>
+            </w:r>
+          </w:p>
+        </w:tc>
+        <w:tc>
+          <w:tcPr>
+            <w:tcW w:type="dxa" w:w="2880"/>
+            <w:shd w:fill="F2F4F7"/>
+            <w:tcMar>
+              <w:top w:w="80" w:type="dxa"/>
+              <w:bottom w:w="80" w:type="dxa"/>
+              <w:left w:w="120" w:type="dxa"/>
+              <w:right w:w="120" w:type="dxa"/>
+            </w:tcMar>
+            <w:vAlign w:val="center"/>
+          </w:tcPr>
+          <w:p>
+            <w:pPr>
+              <w:spacing w:before="80" w:after="80"/>
+              <w:jc w:val="left"/>
+            </w:pPr>
+            <w:r/>
+            <w:r>
+              <w:rPr>
+                <w:rFonts w:ascii="Calibri" w:hAnsi="Calibri"/>
+                <w:b w:val="0"/>
+                <w:i w:val="0"/>
+                <w:color w:val="222222"/>
+                <w:sz w:val="19"/>
+              </w:rPr>
+              <w:t>Taxa de endurecimento exponencial</w:t>
+            </w:r>
+          </w:p>
+        </w:tc>
+        <w:tc>
+          <w:tcPr>
+            <w:tcW w:type="dxa" w:w="2880"/>
+            <w:shd w:fill="F2F4F7"/>
+            <w:tcMar>
+              <w:top w:w="80" w:type="dxa"/>
+              <w:bottom w:w="80" w:type="dxa"/>
+              <w:left w:w="120" w:type="dxa"/>
+              <w:right w:w="120" w:type="dxa"/>
+            </w:tcMar>
+            <w:vAlign w:val="center"/>
+          </w:tcPr>
+          <w:p>
+            <w:pPr>
+              <w:spacing w:before="80" w:after="80"/>
+              <w:jc w:val="left"/>
+            </w:pPr>
+            <w:r/>
+            <w:r>
+              <w:rPr>
+                <w:rFonts w:ascii="Calibri" w:hAnsi="Calibri"/>
+                <w:b w:val="0"/>
+                <w:i w:val="0"/>
+                <w:color w:val="222222"/>
+                <w:sz w:val="19"/>
+              </w:rPr>
+              <w:t>Explica por que a córnea acomoda flutuações normais de PIO mas resiste a deformação extrema</w:t>
+            </w:r>
+          </w:p>
+        </w:tc>
+      </w:tr>
+      <w:tr>
+        <w:tc>
+          <w:tcPr>
+            <w:tcW w:type="dxa" w:w="2880"/>
+            <w:tcMar>
+              <w:top w:w="80" w:type="dxa"/>
+              <w:bottom w:w="80" w:type="dxa"/>
+              <w:left w:w="120" w:type="dxa"/>
+              <w:right w:w="120" w:type="dxa"/>
+            </w:tcMar>
+            <w:vAlign w:val="center"/>
+          </w:tcPr>
+          <w:p>
+            <w:pPr>
+              <w:spacing w:before="80" w:after="80"/>
+              <w:jc w:val="left"/>
+            </w:pPr>
+            <w:r/>
+            <w:r>
+              <w:rPr>
+                <w:rFonts w:ascii="Calibri" w:hAnsi="Calibri"/>
+                <w:b w:val="0"/>
+                <w:i w:val="0"/>
+                <w:color w:val="222222"/>
+                <w:sz w:val="19"/>
+              </w:rPr>
+              <w:t>κ = 0.09</w:t>
+            </w:r>
+          </w:p>
+        </w:tc>
+        <w:tc>
+          <w:tcPr>
+            <w:tcW w:type="dxa" w:w="2880"/>
+            <w:tcMar>
+              <w:top w:w="80" w:type="dxa"/>
+              <w:bottom w:w="80" w:type="dxa"/>
+              <w:left w:w="120" w:type="dxa"/>
+              <w:right w:w="120" w:type="dxa"/>
+            </w:tcMar>
+            <w:vAlign w:val="center"/>
+          </w:tcPr>
+          <w:p>
+            <w:pPr>
+              <w:spacing w:before="80" w:after="80"/>
+              <w:jc w:val="left"/>
+            </w:pPr>
+            <w:r/>
+            <w:r>
+              <w:rPr>
+                <w:rFonts w:ascii="Calibri" w:hAnsi="Calibri"/>
+                <w:b w:val="0"/>
+                <w:i w:val="0"/>
+                <w:color w:val="222222"/>
+                <w:sz w:val="19"/>
+              </w:rPr>
+              <w:t>Dispersão angular das fibras (0=alinhadas, 1/3=aleatórias)</w:t>
+            </w:r>
+          </w:p>
+        </w:tc>
+        <w:tc>
+          <w:tcPr>
+            <w:tcW w:type="dxa" w:w="2880"/>
+            <w:tcMar>
+              <w:top w:w="80" w:type="dxa"/>
+              <w:bottom w:w="80" w:type="dxa"/>
+              <w:left w:w="120" w:type="dxa"/>
+              <w:right w:w="120" w:type="dxa"/>
+            </w:tcMar>
+            <w:vAlign w:val="center"/>
+          </w:tcPr>
+          <w:p>
+            <w:pPr>
+              <w:spacing w:before="80" w:after="80"/>
+              <w:jc w:val="left"/>
+            </w:pPr>
+            <w:r/>
+            <w:r>
+              <w:rPr>
+                <w:rFonts w:ascii="Calibri" w:hAnsi="Calibri"/>
+                <w:b w:val="0"/>
+                <w:i w:val="0"/>
+                <w:color w:val="222222"/>
+                <w:sz w:val="19"/>
+              </w:rPr>
+              <w:t>Fibras maioritariamente alinhadas significam que o anel funciona diferente conforme a orientação</w:t>
+            </w:r>
+          </w:p>
+        </w:tc>
+      </w:tr>
+      <w:tr>
+        <w:tc>
+          <w:tcPr>
+            <w:tcW w:type="dxa" w:w="2880"/>
+            <w:shd w:fill="F2F4F7"/>
+            <w:tcMar>
+              <w:top w:w="80" w:type="dxa"/>
+              <w:bottom w:w="80" w:type="dxa"/>
+              <w:left w:w="120" w:type="dxa"/>
+              <w:right w:w="120" w:type="dxa"/>
+            </w:tcMar>
+            <w:vAlign w:val="center"/>
+          </w:tcPr>
+          <w:p>
+            <w:pPr>
+              <w:spacing w:before="80" w:after="80"/>
+              <w:jc w:val="left"/>
+            </w:pPr>
+            <w:r/>
+            <w:r>
+              <w:rPr>
+                <w:rFonts w:ascii="Calibri" w:hAnsi="Calibri"/>
+                <w:b w:val="0"/>
+                <w:i w:val="0"/>
+                <w:color w:val="222222"/>
+                <w:sz w:val="19"/>
+              </w:rPr>
+              <w:t>Ciclo de Dupps</w:t>
+            </w:r>
+          </w:p>
+        </w:tc>
+        <w:tc>
+          <w:tcPr>
+            <w:tcW w:type="dxa" w:w="2880"/>
+            <w:shd w:fill="F2F4F7"/>
+            <w:tcMar>
+              <w:top w:w="80" w:type="dxa"/>
+              <w:bottom w:w="80" w:type="dxa"/>
+              <w:left w:w="120" w:type="dxa"/>
+              <w:right w:w="120" w:type="dxa"/>
+            </w:tcMar>
+            <w:vAlign w:val="center"/>
+          </w:tcPr>
+          <w:p>
+            <w:pPr>
+              <w:spacing w:before="80" w:after="80"/>
+              <w:jc w:val="left"/>
+            </w:pPr>
+            <w:r/>
+            <w:r>
+              <w:rPr>
+                <w:rFonts w:ascii="Calibri" w:hAnsi="Calibri"/>
+                <w:b w:val="0"/>
+                <w:i w:val="0"/>
+                <w:color w:val="222222"/>
+                <w:sz w:val="19"/>
+              </w:rPr>
+              <w:t>Feedback positivo: fraqueza → deformação → mais tensão → mais fraqueza</w:t>
+            </w:r>
+          </w:p>
+        </w:tc>
+        <w:tc>
+          <w:tcPr>
+            <w:tcW w:type="dxa" w:w="2880"/>
+            <w:shd w:fill="F2F4F7"/>
+            <w:tcMar>
+              <w:top w:w="80" w:type="dxa"/>
+              <w:bottom w:w="80" w:type="dxa"/>
+              <w:left w:w="120" w:type="dxa"/>
+              <w:right w:w="120" w:type="dxa"/>
+            </w:tcMar>
+            <w:vAlign w:val="center"/>
+          </w:tcPr>
+          <w:p>
+            <w:pPr>
+              <w:spacing w:before="80" w:after="80"/>
+              <w:jc w:val="left"/>
+            </w:pPr>
+            <w:r/>
+            <w:r>
+              <w:rPr>
+                <w:rFonts w:ascii="Calibri" w:hAnsi="Calibri"/>
+                <w:b w:val="0"/>
+                <w:i w:val="0"/>
+                <w:color w:val="222222"/>
+                <w:sz w:val="19"/>
+              </w:rPr>
+              <w:t>Explica a progressão do ceratocone e por que CXL (reforça fibras) e ICRS (redistribui tensão) funcionam</w:t>
+            </w:r>
+          </w:p>
+        </w:tc>
+      </w:tr>
+      <w:tr>
+        <w:tc>
+          <w:tcPr>
+            <w:tcW w:type="dxa" w:w="2880"/>
+            <w:tcMar>
+              <w:top w:w="80" w:type="dxa"/>
+              <w:bottom w:w="80" w:type="dxa"/>
+              <w:left w:w="120" w:type="dxa"/>
+              <w:right w:w="120" w:type="dxa"/>
+            </w:tcMar>
+            <w:vAlign w:val="center"/>
+          </w:tcPr>
+          <w:p>
+            <w:pPr>
+              <w:spacing w:before="80" w:after="80"/>
+              <w:jc w:val="left"/>
+            </w:pPr>
+            <w:r/>
+            <w:r>
+              <w:rPr>
+                <w:rFonts w:ascii="Calibri" w:hAnsi="Calibri"/>
+                <w:b w:val="0"/>
+                <w:i w:val="0"/>
+                <w:color w:val="222222"/>
+                <w:sz w:val="19"/>
+              </w:rPr>
+              <w:t>Anisotropia</w:t>
+            </w:r>
+          </w:p>
+        </w:tc>
+        <w:tc>
+          <w:tcPr>
+            <w:tcW w:type="dxa" w:w="2880"/>
+            <w:tcMar>
+              <w:top w:w="80" w:type="dxa"/>
+              <w:bottom w:w="80" w:type="dxa"/>
+              <w:left w:w="120" w:type="dxa"/>
+              <w:right w:w="120" w:type="dxa"/>
+            </w:tcMar>
+            <w:vAlign w:val="center"/>
+          </w:tcPr>
+          <w:p>
+            <w:pPr>
+              <w:spacing w:before="80" w:after="80"/>
+              <w:jc w:val="left"/>
+            </w:pPr>
+            <w:r/>
+            <w:r>
+              <w:rPr>
+                <w:rFonts w:ascii="Calibri" w:hAnsi="Calibri"/>
+                <w:b w:val="0"/>
+                <w:i w:val="0"/>
+                <w:color w:val="222222"/>
+                <w:sz w:val="19"/>
+              </w:rPr>
+              <w:t>Rigidez varia conforme a direção e a região</w:t>
+            </w:r>
+          </w:p>
+        </w:tc>
+        <w:tc>
+          <w:tcPr>
+            <w:tcW w:type="dxa" w:w="2880"/>
+            <w:tcMar>
+              <w:top w:w="80" w:type="dxa"/>
+              <w:bottom w:w="80" w:type="dxa"/>
+              <w:left w:w="120" w:type="dxa"/>
+              <w:right w:w="120" w:type="dxa"/>
+            </w:tcMar>
+            <w:vAlign w:val="center"/>
+          </w:tcPr>
+          <w:p>
+            <w:pPr>
+              <w:spacing w:before="80" w:after="80"/>
+              <w:jc w:val="left"/>
+            </w:pPr>
+            <w:r/>
+            <w:r>
+              <w:rPr>
+                <w:rFonts w:ascii="Calibri" w:hAnsi="Calibri"/>
+                <w:b w:val="0"/>
+                <w:i w:val="0"/>
+                <w:color w:val="222222"/>
+                <w:sz w:val="19"/>
+              </w:rPr>
+              <w:t>O efeito do anel depende da orientação local das fibras de colagénio</w:t>
+            </w:r>
+          </w:p>
+        </w:tc>
+      </w:tr>
+      <w:tr>
+        <w:tc>
+          <w:tcPr>
+            <w:tcW w:type="dxa" w:w="2880"/>
+            <w:shd w:fill="F2F4F7"/>
+            <w:tcMar>
+              <w:top w:w="80" w:type="dxa"/>
+              <w:bottom w:w="80" w:type="dxa"/>
+              <w:left w:w="120" w:type="dxa"/>
+              <w:right w:w="120" w:type="dxa"/>
+            </w:tcMar>
+            <w:vAlign w:val="center"/>
+          </w:tcPr>
+          <w:p>
+            <w:pPr>
+              <w:spacing w:before="80" w:after="80"/>
+              <w:jc w:val="left"/>
+            </w:pPr>
+            <w:r/>
+            <w:r>
+              <w:rPr>
+                <w:rFonts w:ascii="Calibri" w:hAnsi="Calibri"/>
+                <w:b w:val="0"/>
+                <w:i w:val="0"/>
+                <w:color w:val="222222"/>
+                <w:sz w:val="19"/>
+              </w:rPr>
+              <w:t>PIO como motor</w:t>
+            </w:r>
+          </w:p>
+        </w:tc>
+        <w:tc>
+          <w:tcPr>
+            <w:tcW w:type="dxa" w:w="2880"/>
+            <w:shd w:fill="F2F4F7"/>
+            <w:tcMar>
+              <w:top w:w="80" w:type="dxa"/>
+              <w:bottom w:w="80" w:type="dxa"/>
+              <w:left w:w="120" w:type="dxa"/>
+              <w:right w:w="120" w:type="dxa"/>
+            </w:tcMar>
+            <w:vAlign w:val="center"/>
+          </w:tcPr>
+          <w:p>
+            <w:pPr>
+              <w:spacing w:before="80" w:after="80"/>
+              <w:jc w:val="left"/>
+            </w:pPr>
+            <w:r/>
+            <w:r>
+              <w:rPr>
+                <w:rFonts w:ascii="Calibri" w:hAnsi="Calibri"/>
+                <w:b w:val="0"/>
+                <w:i w:val="0"/>
+                <w:color w:val="222222"/>
+                <w:sz w:val="19"/>
+              </w:rPr>
+              <w:t>15 mmHg gera uz = 360,9 μm de deslocamento central</w:t>
+            </w:r>
+          </w:p>
+        </w:tc>
+        <w:tc>
+          <w:tcPr>
+            <w:tcW w:type="dxa" w:w="2880"/>
+            <w:shd w:fill="F2F4F7"/>
+            <w:tcMar>
+              <w:top w:w="80" w:type="dxa"/>
+              <w:bottom w:w="80" w:type="dxa"/>
+              <w:left w:w="120" w:type="dxa"/>
+              <w:right w:w="120" w:type="dxa"/>
+            </w:tcMar>
+            <w:vAlign w:val="center"/>
+          </w:tcPr>
+          <w:p>
+            <w:pPr>
+              <w:spacing w:before="80" w:after="80"/>
+              <w:jc w:val="left"/>
+            </w:pPr>
+            <w:r/>
+            <w:r>
+              <w:rPr>
+                <w:rFonts w:ascii="Calibri" w:hAnsi="Calibri"/>
+                <w:b w:val="0"/>
+                <w:i w:val="0"/>
+                <w:color w:val="222222"/>
+                <w:sz w:val="19"/>
+              </w:rPr>
+              <w:t>Mesmo PIO normal deforma significativamente uma córnea enfraquecida</w:t>
+            </w:r>
+          </w:p>
+        </w:tc>
+      </w:tr>
+      <w:tr>
+        <w:tc>
+          <w:tcPr>
+            <w:tcW w:type="dxa" w:w="2880"/>
+            <w:tcMar>
+              <w:top w:w="80" w:type="dxa"/>
+              <w:bottom w:w="80" w:type="dxa"/>
+              <w:left w:w="120" w:type="dxa"/>
+              <w:right w:w="120" w:type="dxa"/>
+            </w:tcMar>
+            <w:vAlign w:val="center"/>
+          </w:tcPr>
+          <w:p>
+            <w:pPr>
+              <w:spacing w:before="80" w:after="80"/>
+              <w:jc w:val="left"/>
+            </w:pPr>
+            <w:r/>
+            <w:r>
+              <w:rPr>
+                <w:rFonts w:ascii="Calibri" w:hAnsi="Calibri"/>
+                <w:b w:val="0"/>
+                <w:i w:val="0"/>
+                <w:color w:val="222222"/>
+                <w:sz w:val="19"/>
+              </w:rPr>
+              <w:t>Estroma anterior vs posterior</w:t>
+            </w:r>
+          </w:p>
+        </w:tc>
+        <w:tc>
+          <w:tcPr>
+            <w:tcW w:type="dxa" w:w="2880"/>
+            <w:tcMar>
+              <w:top w:w="80" w:type="dxa"/>
+              <w:bottom w:w="80" w:type="dxa"/>
+              <w:left w:w="120" w:type="dxa"/>
+              <w:right w:w="120" w:type="dxa"/>
+            </w:tcMar>
+            <w:vAlign w:val="center"/>
+          </w:tcPr>
+          <w:p>
+            <w:pPr>
+              <w:spacing w:before="80" w:after="80"/>
+              <w:jc w:val="left"/>
+            </w:pPr>
+            <w:r/>
+            <w:r>
+              <w:rPr>
+                <w:rFonts w:ascii="Calibri" w:hAnsi="Calibri"/>
+                <w:b w:val="0"/>
+                <w:i w:val="0"/>
+                <w:color w:val="222222"/>
+                <w:sz w:val="19"/>
+              </w:rPr>
+              <w:t>Anterior 2-3× mais rígido; posterior falha primeiro no KC</w:t>
+            </w:r>
+          </w:p>
+        </w:tc>
+        <w:tc>
+          <w:tcPr>
+            <w:tcW w:type="dxa" w:w="2880"/>
+            <w:tcMar>
+              <w:top w:w="80" w:type="dxa"/>
+              <w:bottom w:w="80" w:type="dxa"/>
+              <w:left w:w="120" w:type="dxa"/>
+              <w:right w:w="120" w:type="dxa"/>
+            </w:tcMar>
+            <w:vAlign w:val="center"/>
+          </w:tcPr>
+          <w:p>
+            <w:pPr>
+              <w:spacing w:before="80" w:after="80"/>
+              <w:jc w:val="left"/>
+            </w:pPr>
+            <w:r/>
+            <w:r>
+              <w:rPr>
+                <w:rFonts w:ascii="Calibri" w:hAnsi="Calibri"/>
+                <w:b w:val="0"/>
+                <w:i w:val="0"/>
+                <w:color w:val="222222"/>
+                <w:sz w:val="19"/>
+              </w:rPr>
+              <w:t>O ICRS é implantado a 70–80% de profundidade para interagir com o estroma de suporte de carga</w:t>
+            </w:r>
+          </w:p>
+        </w:tc>
+      </w:tr>
+    </w:tbl>
+    <w:p>
+      <w:pPr>
+        <w:spacing w:before="120" w:after="120"/>
+      </w:pPr>
+    </w:p>
+    <w:p>
+      <w:pPr>
         <w:spacing w:before="240" w:after="240"/>
         <w:jc w:val="center"/>
       </w:pPr>

</xml_diff>